<commit_message>
feat(docs): Update to documentation and artifacts
</commit_message>
<xml_diff>
--- a/docs/bridge_v3 .docx
+++ b/docs/bridge_v3 .docx
@@ -1113,11 +1113,6 @@
     </w:tbl>
     <w:p>
       <w:pPr>
-        <w:spacing w:after="240" w:before="0"/>
-      </w:pPr>
-    </w:p>
-    <w:p>
-      <w:pPr>
         <w:pStyle w:val="Heading1"/>
         <w:spacing w:after="160" w:before="480"/>
       </w:pPr>
@@ -1145,18 +1140,15 @@
       <w:pPr>
         <w:spacing w:after="100" w:before="80"/>
       </w:pPr>
-      <w:r>
-        <w:rPr>
-          <w:rFonts w:ascii="Calibri" w:cs="Calibri" w:eastAsia="Calibri" w:hAnsi="Calibri"/>
-          <w:b w:val="false"/>
-          <w:bCs w:val="false"/>
-          <w:i w:val="false"/>
-          <w:iCs w:val="false"/>
-          <w:color w:val="0F172A"/>
+      <w:r/>
+      <w:r>
+        <w:rPr>
+          <w:rFonts w:ascii="Calibri" w:hAnsi="Calibri"/>
+          <w:b w:val="0"/>
+          <w:i w:val="0"/>
           <w:sz w:val="22"/>
-          <w:szCs w:val="22"/>
-        </w:rPr>
-        <w:t>Bridge has no dedicated router node. Every server runs an identical Bridge daemon. The daemons form a peer mesh over WireGuard, share routing state and membership through a gossip protocol, and collectively elect one node as the active leader at any time. The active leader handles all inbound public traffic. If it fails, peers detect it, elect a new leader, and the new leader acquires the public entry point — either by reconnecting a Cloudflare Tunnel or by moving a provider floating IP.</w:t>
+        </w:rPr>
+        <w:t>Bridge has no dedicated router node. Every server runs an identical Bridge daemon. The daemons form a peer mesh over WireGuard, share routing state and membership through a gossip protocol, and collectively elect one node as the active leader at any time. The active leader handles all inbound public traffic, operating in either Direct mode (L7 reverse proxy) or Handoff mode (SNI-based L4 transparent passthrough). If the active leader fails, peers detect it, elect a new leader, and the new leader acquires the public entry point — either by reconnecting a Cloudflare Tunnel or by moving a provider floating IP.</w:t>
       </w:r>
     </w:p>
     <w:p>
@@ -5645,11 +5637,6 @@
         </w:tc>
       </w:tr>
     </w:tbl>
-    <w:p>
-      <w:pPr>
-        <w:spacing w:after="120" w:before="0"/>
-      </w:pPr>
-    </w:p>
     <w:p>
       <w:pPr>
         <w:pBdr>
@@ -6828,293 +6815,369 @@
     </w:tbl>
     <w:p>
       <w:pPr>
-        <w:spacing w:after="240" w:before="0"/>
-      </w:pPr>
-    </w:p>
-    <w:p>
-      <w:pPr>
         <w:pStyle w:val="Heading2"/>
         <w:spacing w:after="120" w:before="360"/>
       </w:pPr>
-      <w:r>
-        <w:rPr>
-          <w:rFonts w:ascii="Calibri" w:cs="Calibri" w:eastAsia="Calibri" w:hAnsi="Calibri"/>
+      <w:r/>
+      <w:r>
+        <w:rPr>
+          <w:rFonts w:ascii="Calibri" w:hAnsi="Calibri"/>
           <w:b/>
-          <w:bCs/>
-          <w:color w:val="6366F1"/>
-          <w:sz w:val="34"/>
-          <w:szCs w:val="34"/>
-        </w:rPr>
-        <w:t xml:space="preserve">3.6 Coolify &amp; Nginx Compatibility</w:t>
+          <w:i w:val="0"/>
+          <w:color w:val="0B2545"/>
+          <w:sz w:val="32"/>
+        </w:rPr>
+        <w:t>3.6 Proxy Architecture: Direct vs Handoff Modes</w:t>
       </w:r>
     </w:p>
     <w:p>
       <w:pPr>
         <w:spacing w:after="100" w:before="80"/>
       </w:pPr>
-      <w:r>
-        <w:rPr>
-          <w:rFonts w:ascii="Calibri" w:cs="Calibri" w:eastAsia="Calibri" w:hAnsi="Calibri"/>
-          <w:b w:val="false"/>
-          <w:bCs w:val="false"/>
-          <w:i w:val="false"/>
-          <w:iCs w:val="false"/>
-          <w:color w:val="0F172A"/>
+      <w:r/>
+      <w:r>
+        <w:rPr>
+          <w:rFonts w:ascii="Calibri" w:hAnsi="Calibri"/>
+          <w:b w:val="0"/>
+          <w:i w:val="0"/>
           <w:sz w:val="22"/>
-          <w:szCs w:val="22"/>
-        </w:rPr>
-        <w:t>Bridge is not a replacement for Coolify's proxy or Nginx. It sits above them — aware of what services are running across the fleet and routing inbound traffic to the correct node. The node-level proxy (Coolify, Nginx, Caddy) handles everything from that point on.</w:t>
-      </w:r>
-    </w:p>
-    <w:p>
-      <w:pPr>
+        </w:rPr>
+        <w:t>Bridge operates in two distinct proxy modes depending on whether TLS termination and local container routing are centralized at Bridge or delegated to node-level local proxies like Coolify:</w:t>
+      </w:r>
+    </w:p>
+    <w:p>
+      <w:pPr>
+        <w:pStyle w:val="ListParagraph"/>
         <w:spacing w:after="120" w:before="0"/>
       </w:pPr>
-    </w:p>
-    <w:p>
-      <w:pPr>
-        <w:shd w:fill="F1F5F9" w:val="clear"/>
-        <w:spacing w:after="30" w:before="30"/>
-        <w:ind w:left="360"/>
-      </w:pPr>
-      <w:r>
-        <w:rPr>
-          <w:rFonts w:ascii="Courier New" w:cs="Courier New" w:eastAsia="Courier New" w:hAnsi="Courier New"/>
-          <w:color w:val="1E293B"/>
-          <w:sz w:val="18"/>
-          <w:szCs w:val="18"/>
-        </w:rPr>
-        <w:t xml:space="preserve">  Bridge (fleet-aware entry point)</w:t>
-      </w:r>
-    </w:p>
-    <w:p>
-      <w:pPr>
-        <w:shd w:fill="F1F5F9" w:val="clear"/>
-        <w:spacing w:after="30" w:before="30"/>
-        <w:ind w:left="360"/>
-      </w:pPr>
-      <w:r>
-        <w:rPr>
-          <w:rFonts w:ascii="Courier New" w:cs="Courier New" w:eastAsia="Courier New" w:hAnsi="Courier New"/>
-          <w:color w:val="1E293B"/>
-          <w:sz w:val="18"/>
-          <w:szCs w:val="18"/>
-        </w:rPr>
-        <w:t xml:space="preserve">  Knows: which service is on which node</w:t>
-      </w:r>
-    </w:p>
-    <w:p>
-      <w:pPr>
-        <w:shd w:fill="F1F5F9" w:val="clear"/>
-        <w:spacing w:after="30" w:before="30"/>
-        <w:ind w:left="360"/>
-      </w:pPr>
-      <w:r>
-        <w:rPr>
-          <w:rFonts w:ascii="Courier New" w:cs="Courier New" w:eastAsia="Courier New" w:hAnsi="Courier New"/>
-          <w:color w:val="1E293B"/>
-          <w:sz w:val="18"/>
-          <w:szCs w:val="18"/>
-        </w:rPr>
-        <w:t xml:space="preserve">         │</w:t>
-      </w:r>
-    </w:p>
-    <w:p>
-      <w:pPr>
-        <w:shd w:fill="F1F5F9" w:val="clear"/>
-        <w:spacing w:after="30" w:before="30"/>
-        <w:ind w:left="360"/>
-      </w:pPr>
-      <w:r>
-        <w:rPr>
-          <w:rFonts w:ascii="Courier New" w:cs="Courier New" w:eastAsia="Courier New" w:hAnsi="Courier New"/>
-          <w:color w:val="1E293B"/>
-          <w:sz w:val="18"/>
-          <w:szCs w:val="18"/>
-        </w:rPr>
-        <w:t xml:space="preserve">         ├── Node A: Coolify proxy → containers</w:t>
-      </w:r>
-    </w:p>
-    <w:p>
-      <w:pPr>
-        <w:shd w:fill="F1F5F9" w:val="clear"/>
-        <w:spacing w:after="30" w:before="30"/>
-        <w:ind w:left="360"/>
-      </w:pPr>
-      <w:r>
-        <w:rPr>
-          <w:rFonts w:ascii="Courier New" w:cs="Courier New" w:eastAsia="Courier New" w:hAnsi="Courier New"/>
-          <w:color w:val="1E293B"/>
-          <w:sz w:val="18"/>
-          <w:szCs w:val="18"/>
-        </w:rPr>
-        <w:t xml:space="preserve">         │          (Coolify manages its own routing internally)</w:t>
-      </w:r>
-    </w:p>
-    <w:p>
-      <w:pPr>
-        <w:shd w:fill="F1F5F9" w:val="clear"/>
-        <w:spacing w:after="30" w:before="30"/>
-        <w:ind w:left="360"/>
-      </w:pPr>
-      <w:r>
-        <w:rPr>
-          <w:rFonts w:ascii="Courier New" w:cs="Courier New" w:eastAsia="Courier New" w:hAnsi="Courier New"/>
-          <w:color w:val="1E293B"/>
-          <w:sz w:val="18"/>
-          <w:szCs w:val="18"/>
-        </w:rPr>
-        <w:t xml:space="preserve">         │</w:t>
-      </w:r>
-    </w:p>
-    <w:p>
-      <w:pPr>
-        <w:shd w:fill="F1F5F9" w:val="clear"/>
-        <w:spacing w:after="30" w:before="30"/>
-        <w:ind w:left="360"/>
-      </w:pPr>
-      <w:r>
-        <w:rPr>
-          <w:rFonts w:ascii="Courier New" w:cs="Courier New" w:eastAsia="Courier New" w:hAnsi="Courier New"/>
-          <w:color w:val="1E293B"/>
-          <w:sz w:val="18"/>
-          <w:szCs w:val="18"/>
-        </w:rPr>
-        <w:t xml:space="preserve">         ├── Node B: Nginx → services</w:t>
-      </w:r>
-    </w:p>
-    <w:p>
-      <w:pPr>
-        <w:shd w:fill="F1F5F9" w:val="clear"/>
-        <w:spacing w:after="30" w:before="30"/>
-        <w:ind w:left="360"/>
-      </w:pPr>
-      <w:r>
-        <w:rPr>
-          <w:rFonts w:ascii="Courier New" w:cs="Courier New" w:eastAsia="Courier New" w:hAnsi="Courier New"/>
-          <w:color w:val="1E293B"/>
-          <w:sz w:val="18"/>
-          <w:szCs w:val="18"/>
-        </w:rPr>
-        <w:t xml:space="preserve">         │          (standard Nginx reverse proxy)</w:t>
-      </w:r>
-    </w:p>
-    <w:p>
-      <w:pPr>
-        <w:shd w:fill="F1F5F9" w:val="clear"/>
-        <w:spacing w:after="30" w:before="30"/>
-        <w:ind w:left="360"/>
-      </w:pPr>
-      <w:r>
-        <w:rPr>
-          <w:rFonts w:ascii="Courier New" w:cs="Courier New" w:eastAsia="Courier New" w:hAnsi="Courier New"/>
-          <w:color w:val="1E293B"/>
-          <w:sz w:val="18"/>
-          <w:szCs w:val="18"/>
-        </w:rPr>
-        <w:t xml:space="preserve">         │</w:t>
-      </w:r>
-    </w:p>
-    <w:p>
-      <w:pPr>
-        <w:shd w:fill="F1F5F9" w:val="clear"/>
-        <w:spacing w:after="30" w:before="30"/>
-        <w:ind w:left="360"/>
-      </w:pPr>
-      <w:r>
-        <w:rPr>
-          <w:rFonts w:ascii="Courier New" w:cs="Courier New" w:eastAsia="Courier New" w:hAnsi="Courier New"/>
-          <w:color w:val="1E293B"/>
-          <w:sz w:val="18"/>
-          <w:szCs w:val="18"/>
-        </w:rPr>
-        <w:t xml:space="preserve">         └── Node C: bare service on port</w:t>
-      </w:r>
-    </w:p>
-    <w:p>
-      <w:pPr>
-        <w:shd w:fill="F1F5F9" w:val="clear"/>
-        <w:spacing w:after="30" w:before="30"/>
-        <w:ind w:left="360"/>
-      </w:pPr>
-      <w:r>
-        <w:rPr>
-          <w:rFonts w:ascii="Courier New" w:cs="Courier New" w:eastAsia="Courier New" w:hAnsi="Courier New"/>
-          <w:color w:val="1E293B"/>
-          <w:sz w:val="18"/>
-          <w:szCs w:val="18"/>
-        </w:rPr>
-        <w:t xml:space="preserve">                    (no proxy — direct connection)</w:t>
-      </w:r>
-    </w:p>
-    <w:p>
-      <w:pPr>
+      <w:r/>
+      <w:r>
+        <w:rPr>
+          <w:rFonts w:ascii="Calibri" w:hAnsi="Calibri"/>
+          <w:b w:val="0"/>
+          <w:i w:val="0"/>
+          <w:sz w:val="22"/>
+        </w:rPr>
+        <w:t>•  Direct Mode: domain → Bridge → VM → service (Bridge terminates TLS and acts as an L7 reverse proxy).</w:t>
+      </w:r>
+    </w:p>
+    <w:p>
+      <w:pPr>
+        <w:pStyle w:val="ListParagraph"/>
+        <w:shd w:fill="F1F5F9" w:val="clear"/>
+        <w:spacing w:after="30" w:before="30"/>
+        <w:ind w:left="360"/>
+      </w:pPr>
+      <w:r/>
+      <w:r>
+        <w:rPr>
+          <w:rFonts w:ascii="Calibri" w:hAnsi="Calibri"/>
+          <w:b w:val="0"/>
+          <w:i w:val="0"/>
+          <w:sz w:val="22"/>
+        </w:rPr>
+        <w:t>•  Handoff Mode: domain → Bridge → VM's Coolify proxy → service (Bridge acts as an SNI-based L4 router; Coolify proxy handles local L7 routing).</w:t>
+      </w:r>
+    </w:p>
+    <w:p>
+      <w:pPr>
+        <w:shd w:fill="F1F5F9" w:val="clear"/>
+        <w:spacing w:after="30" w:before="30"/>
+        <w:ind w:left="360"/>
+      </w:pPr>
+      <w:r/>
+    </w:p>
+    <w:p>
+      <w:pPr>
+        <w:pStyle w:val="Heading3"/>
+        <w:shd w:fill="F1F5F9" w:val="clear"/>
+        <w:spacing w:after="30" w:before="30"/>
+        <w:ind w:left="360"/>
+      </w:pPr>
+      <w:r/>
+      <w:r>
+        <w:rPr>
+          <w:rFonts w:ascii="Calibri" w:hAnsi="Calibri"/>
+          <w:b/>
+          <w:i w:val="0"/>
+          <w:color w:val="13678A"/>
+          <w:sz w:val="26"/>
+        </w:rPr>
+        <w:t>3.6.1 Handoff Mode — SNI-Based L4 Passthrough Router (Default / Experimental)</w:t>
+      </w:r>
+    </w:p>
+    <w:p>
+      <w:pPr>
+        <w:shd w:fill="F1F5F9" w:val="clear"/>
+        <w:spacing w:after="30" w:before="30"/>
+        <w:ind w:left="360"/>
+      </w:pPr>
+      <w:r/>
+      <w:r>
+        <w:rPr>
+          <w:rFonts w:ascii="Calibri" w:hAnsi="Calibri"/>
+          <w:b w:val="0"/>
+          <w:i w:val="0"/>
+          <w:sz w:val="22"/>
+        </w:rPr>
+        <w:t>In Handoff mode, Bridge should not handle HTTP routing. Its job is to identify the requested domain, determine which VM owns that domain, and transparently forward the TCP/TLS connection to that VM's Coolify proxy.</w:t>
+      </w:r>
+    </w:p>
+    <w:p>
+      <w:pPr>
+        <w:shd w:fill="F1F5F9" w:val="clear"/>
+        <w:spacing w:after="30" w:before="30"/>
+        <w:ind w:left="360"/>
+      </w:pPr>
+      <w:r/>
+      <w:r>
+        <w:rPr>
+          <w:rFonts w:ascii="Calibri" w:hAnsi="Calibri"/>
+          <w:b w:val="0"/>
+          <w:i w:val="0"/>
+          <w:sz w:val="22"/>
+        </w:rPr>
+        <w:t>For TLS passthrough, Bridge inspects the TLS ClientHello to extract the SNI (Server Name Indication) hostname:</w:t>
+      </w:r>
+    </w:p>
+    <w:p>
+      <w:pPr>
+        <w:shd w:fill="F1F5F9" w:val="clear"/>
+        <w:spacing w:after="30" w:before="30"/>
+        <w:ind w:left="360"/>
+      </w:pPr>
+      <w:r/>
+      <w:r>
+        <w:rPr>
+          <w:rFonts w:ascii="Courier New" w:hAnsi="Courier New"/>
+          <w:b w:val="0"/>
+          <w:i w:val="0"/>
+          <w:sz w:val="18"/>
+        </w:rPr>
+        <w:t xml:space="preserve">  app.example.com → VM-03 → VM-03:443 → Coolify Proxy → app container</w:t>
+      </w:r>
+    </w:p>
+    <w:p>
+      <w:pPr>
+        <w:shd w:fill="F1F5F9" w:val="clear"/>
+        <w:spacing w:after="30" w:before="30"/>
+        <w:ind w:left="360"/>
+      </w:pPr>
+      <w:r/>
+      <w:r>
+        <w:rPr>
+          <w:rFonts w:ascii="Calibri" w:hAnsi="Calibri"/>
+          <w:b w:val="0"/>
+          <w:i w:val="0"/>
+          <w:sz w:val="22"/>
+        </w:rPr>
+        <w:t>Bridge does not terminate TLS, does not hold TLS certificates for customer domains, and does not parse or modify HTTP. It acts strictly as an SNI-based L4 router for this part of the system.</w:t>
+      </w:r>
+    </w:p>
+    <w:p>
+      <w:pPr>
+        <w:shd w:fill="F1F5F9" w:val="clear"/>
+        <w:spacing w:after="30" w:before="30"/>
+        <w:ind w:left="360"/>
+      </w:pPr>
+      <w:r/>
+      <w:r>
+        <w:rPr>
+          <w:rFonts w:ascii="Calibri" w:hAnsi="Calibri"/>
+          <w:b w:val="0"/>
+          <w:i w:val="0"/>
+          <w:sz w:val="22"/>
+        </w:rPr>
+        <w:t>When a client opens a TLS connection:</w:t>
+      </w:r>
+    </w:p>
+    <w:p>
+      <w:pPr>
+        <w:pStyle w:val="ListParagraph"/>
+        <w:shd w:fill="F1F5F9" w:val="clear"/>
+        <w:spacing w:after="30" w:before="30"/>
+        <w:ind w:left="360"/>
+      </w:pPr>
+      <w:r/>
+      <w:r>
+        <w:rPr>
+          <w:rFonts w:ascii="Calibri" w:hAnsi="Calibri"/>
+          <w:b w:val="0"/>
+          <w:i w:val="0"/>
+          <w:sz w:val="22"/>
+        </w:rPr>
+        <w:t>1. Client sends TLS ClientHello: Bridge reads the initial TCP handshake packet and parses the SNI extension bytes without decrypting the payload.</w:t>
+      </w:r>
+    </w:p>
+    <w:p>
+      <w:pPr>
+        <w:pStyle w:val="ListParagraph"/>
+        <w:shd w:fill="F1F5F9" w:val="clear"/>
+        <w:spacing w:after="30" w:before="30"/>
+        <w:ind w:left="360"/>
+      </w:pPr>
+      <w:r/>
+      <w:r>
+        <w:rPr>
+          <w:rFonts w:ascii="Calibri" w:hAnsi="Calibri"/>
+          <w:b w:val="0"/>
+          <w:i w:val="0"/>
+          <w:sz w:val="22"/>
+        </w:rPr>
+        <w:t>2. Domain Registry Lookup: Bridge queries its gossiped domain routing table (e.g. app.example.com → VM-03).</w:t>
+      </w:r>
+    </w:p>
+    <w:p>
+      <w:pPr>
+        <w:pStyle w:val="ListParagraph"/>
+        <w:shd w:fill="F1F5F9" w:val="clear"/>
+        <w:spacing w:after="30" w:before="30"/>
+        <w:ind w:left="360"/>
+      </w:pPr>
+      <w:r/>
+      <w:r>
+        <w:rPr>
+          <w:rFonts w:ascii="Calibri" w:hAnsi="Calibri"/>
+          <w:b w:val="0"/>
+          <w:i w:val="0"/>
+          <w:sz w:val="22"/>
+        </w:rPr>
+        <w:t>3. Transparent L4 Forwarding: Bridge opens a TCP connection to VM-03:443 over the encrypted WireGuard mesh and transparently pipes bidirectional TCP streams (using zero-copy TCP splicing / io::copy_bidirectional).</w:t>
+      </w:r>
+    </w:p>
+    <w:p>
+      <w:pPr>
+        <w:pStyle w:val="ListParagraph"/>
         <w:spacing w:after="120" w:before="0"/>
       </w:pPr>
+      <w:r/>
+      <w:r>
+        <w:rPr>
+          <w:rFonts w:ascii="Calibri" w:hAnsi="Calibri"/>
+          <w:b w:val="0"/>
+          <w:i w:val="0"/>
+          <w:sz w:val="22"/>
+        </w:rPr>
+        <w:t>4. Local Coolify Proxy Routing: VM-03's Coolify proxy (Traefik/Caddy/Nginx) receives the stream, terminates TLS using its locally provisioned Let's Encrypt certificates, and routes the decrypted HTTP request to the local application container.</w:t>
+      </w:r>
     </w:p>
     <w:p>
       <w:pPr>
         <w:spacing w:after="100" w:before="80"/>
       </w:pPr>
-      <w:r>
-        <w:rPr>
-          <w:rFonts w:ascii="Calibri" w:cs="Calibri" w:eastAsia="Calibri" w:hAnsi="Calibri"/>
-          <w:b w:val="false"/>
-          <w:bCs w:val="false"/>
-          <w:i w:val="false"/>
-          <w:iCs w:val="false"/>
-          <w:color w:val="0F172A"/>
+      <w:r/>
+    </w:p>
+    <w:p>
+      <w:pPr>
+        <w:pStyle w:val="Heading3"/>
+        <w:spacing w:after="120" w:before="0"/>
+      </w:pPr>
+      <w:r/>
+      <w:r>
+        <w:rPr>
+          <w:rFonts w:ascii="Calibri" w:hAnsi="Calibri"/>
+          <w:b/>
+          <w:i w:val="0"/>
+          <w:color w:val="13678A"/>
+          <w:sz w:val="26"/>
+        </w:rPr>
+        <w:t>3.6.2 Direct Mode — L7 Reverse Proxy</w:t>
+      </w:r>
+    </w:p>
+    <w:p>
+      <w:pPr>
+        <w:spacing w:after="100" w:before="80"/>
+      </w:pPr>
+      <w:r/>
+      <w:r>
+        <w:rPr>
+          <w:rFonts w:ascii="Calibri" w:hAnsi="Calibri"/>
+          <w:b w:val="0"/>
+          <w:i w:val="0"/>
           <w:sz w:val="22"/>
-          <w:szCs w:val="22"/>
-        </w:rPr>
-        <w:t>Bridge routes based on hostname → node:port. What handles the request once it reaches the node is not Bridge's concern.</w:t>
+        </w:rPr>
+        <w:t>In Direct mode, Bridge acts as a full HTTP/HTTPS reverse proxy built on Hyper and Rustls:</w:t>
+      </w:r>
+    </w:p>
+    <w:p>
+      <w:pPr>
+        <w:spacing w:after="100" w:before="80"/>
+      </w:pPr>
+      <w:r/>
+      <w:r>
+        <w:rPr>
+          <w:rFonts w:ascii="Courier New" w:hAnsi="Courier New"/>
+          <w:b w:val="0"/>
+          <w:i w:val="0"/>
+          <w:sz w:val="18"/>
+        </w:rPr>
+        <w:t xml:space="preserve">  domain → Bridge (L7) → VM → service</w:t>
       </w:r>
     </w:p>
     <w:p>
       <w:pPr>
         <w:spacing w:after="120" w:before="0"/>
       </w:pPr>
-    </w:p>
-    <w:p>
-      <w:pPr>
-        <w:spacing w:after="100" w:before="80"/>
-      </w:pPr>
-      <w:r>
-        <w:rPr>
-          <w:rFonts w:ascii="Calibri" w:cs="Calibri" w:eastAsia="Calibri" w:hAnsi="Calibri"/>
+      <w:r/>
+      <w:r>
+        <w:rPr>
+          <w:rFonts w:ascii="Calibri" w:hAnsi="Calibri"/>
+          <w:b w:val="0"/>
+          <w:i w:val="0"/>
+          <w:sz w:val="22"/>
+        </w:rPr>
+        <w:t>Bridge terminates TLS, provisions and manages ACME certificates directly, inspects HTTP request headers (Host, Path, Headers), and proxies requests directly to backend container ports across the WireGuard mesh. This mode is suitable for environments where servers run bare Docker containers or native systemd services without a local reverse proxy like Coolify.</w:t>
+      </w:r>
+    </w:p>
+    <w:p>
+      <w:pPr>
+        <w:numPr>
+          <w:ilvl w:val="0"/>
+          <w:numId w:val="1"/>
+        </w:numPr>
+        <w:spacing w:after="60" w:before="60"/>
+      </w:pPr>
+      <w:r/>
+    </w:p>
+    <w:p>
+      <w:pPr>
+        <w:pStyle w:val="Heading3"/>
+        <w:numPr>
+          <w:ilvl w:val="0"/>
+          <w:numId w:val="1"/>
+        </w:numPr>
+        <w:spacing w:after="60" w:before="60"/>
+      </w:pPr>
+      <w:r/>
+      <w:r>
+        <w:rPr>
+          <w:rFonts w:ascii="Calibri" w:hAnsi="Calibri"/>
           <w:b/>
-          <w:bCs/>
-          <w:i w:val="false"/>
-          <w:iCs w:val="false"/>
-          <w:color w:val="0F172A"/>
+          <w:i w:val="0"/>
+          <w:color w:val="13678A"/>
+          <w:sz w:val="26"/>
+        </w:rPr>
+        <w:t>3.6.3 Architectural Separation of Concerns</w:t>
+      </w:r>
+    </w:p>
+    <w:p>
+      <w:pPr>
+        <w:numPr>
+          <w:ilvl w:val="0"/>
+          <w:numId w:val="1"/>
+        </w:numPr>
+        <w:spacing w:after="60" w:before="60"/>
+      </w:pPr>
+      <w:r/>
+      <w:r>
+        <w:rPr>
+          <w:rFonts w:ascii="Calibri" w:hAnsi="Calibri"/>
+          <w:b w:val="0"/>
+          <w:i w:val="0"/>
           <w:sz w:val="22"/>
-          <w:szCs w:val="22"/>
-        </w:rPr>
-        <w:t xml:space="preserve">Planned Coolify PR:</w:t>
-      </w:r>
-    </w:p>
-    <w:p>
-      <w:pPr>
-        <w:spacing w:after="100" w:before="80"/>
-      </w:pPr>
-      <w:r>
-        <w:rPr>
-          <w:rFonts w:ascii="Calibri" w:cs="Calibri" w:eastAsia="Calibri" w:hAnsi="Calibri"/>
-          <w:b w:val="false"/>
-          <w:bCs w:val="false"/>
-          <w:i w:val="false"/>
-          <w:iCs w:val="false"/>
-          <w:color w:val="0F172A"/>
-          <w:sz w:val="22"/>
-          <w:szCs w:val="22"/>
-        </w:rPr>
-        <w:t>A pull request to Coolify to add native gossip mesh support — so Coolify automatically registers its services with a Bridge peer on the same node without manual configuration. The integration point is the gossip layer only. When Coolify deploys or removes a service, it emits a gossip event that propagates to all Bridge peers across the fleet.</w:t>
-      </w:r>
-    </w:p>
-    <w:p>
-      <w:pPr>
-        <w:spacing w:after="120" w:before="0"/>
-      </w:pPr>
+        </w:rPr>
+        <w:t>The architectural separation between Bridge and Coolify is clean and complementary:</w:t>
+      </w:r>
     </w:p>
     <w:p>
       <w:pPr>
@@ -7125,100 +7188,71 @@
         </w:numPr>
         <w:spacing w:after="60" w:before="60"/>
       </w:pPr>
-      <w:r>
-        <w:rPr>
-          <w:rFonts w:ascii="Calibri" w:cs="Calibri" w:eastAsia="Calibri" w:hAnsi="Calibri"/>
-          <w:color w:val="0F172A"/>
+      <w:r/>
+      <w:r>
+        <w:rPr>
+          <w:rFonts w:ascii="Calibri" w:hAnsi="Calibri"/>
+          <w:b w:val="0"/>
+          <w:i w:val="0"/>
           <w:sz w:val="22"/>
-          <w:szCs w:val="22"/>
-        </w:rPr>
-        <w:t>Coolify registers services → Bridge gossip → all peers learn the route</w:t>
+        </w:rPr>
+        <w:t>•  Bridge = Global entry-point / fleet-wide traffic router: Manages public ingress (Cloudflare Anycast / Floating IP), leader election, WireGuard mesh, SWIM gossip, peer failure detection, and fleet-wide SNI L4 routing.</w:t>
       </w:r>
     </w:p>
     <w:p>
       <w:pPr>
         <w:pStyle w:val="ListParagraph"/>
-        <w:numPr>
-          <w:ilvl w:val="0"/>
-          <w:numId w:val="1"/>
-        </w:numPr>
-        <w:spacing w:after="60" w:before="60"/>
-      </w:pPr>
-      <w:r>
-        <w:rPr>
-          <w:rFonts w:ascii="Calibri" w:cs="Calibri" w:eastAsia="Calibri" w:hAnsi="Calibri"/>
-          <w:color w:val="0F172A"/>
+        <w:spacing w:after="120" w:before="0"/>
+      </w:pPr>
+      <w:r/>
+      <w:r>
+        <w:rPr>
+          <w:rFonts w:ascii="Calibri" w:hAnsi="Calibri"/>
+          <w:b w:val="0"/>
+          <w:i w:val="0"/>
           <w:sz w:val="22"/>
-          <w:szCs w:val="22"/>
-        </w:rPr>
-        <w:t>Coolify removes a service → Bridge gossip → all peers remove the route</w:t>
-      </w:r>
-    </w:p>
-    <w:p>
-      <w:pPr>
-        <w:pStyle w:val="ListParagraph"/>
-        <w:numPr>
-          <w:ilvl w:val="0"/>
-          <w:numId w:val="1"/>
-        </w:numPr>
-        <w:spacing w:after="60" w:before="60"/>
-      </w:pPr>
-      <w:r>
-        <w:rPr>
-          <w:rFonts w:ascii="Calibri" w:cs="Calibri" w:eastAsia="Calibri" w:hAnsi="Calibri"/>
-          <w:color w:val="0F172A"/>
-          <w:sz w:val="22"/>
-          <w:szCs w:val="22"/>
-        </w:rPr>
-        <w:t xml:space="preserve">No change to Coolify's internal proxy — it still handles node-level routing</w:t>
-      </w:r>
-    </w:p>
-    <w:p>
-      <w:pPr>
-        <w:pStyle w:val="ListParagraph"/>
-        <w:numPr>
-          <w:ilvl w:val="0"/>
-          <w:numId w:val="1"/>
-        </w:numPr>
-        <w:spacing w:after="60" w:before="60"/>
-      </w:pPr>
-      <w:r>
-        <w:rPr>
-          <w:rFonts w:ascii="Calibri" w:cs="Calibri" w:eastAsia="Calibri" w:hAnsi="Calibri"/>
-          <w:color w:val="0F172A"/>
-          <w:sz w:val="22"/>
-          <w:szCs w:val="22"/>
-        </w:rPr>
-        <w:t>Bridge handles fleet-level routing — which node has the service</w:t>
-      </w:r>
+        </w:rPr>
+        <w:t>•  Coolify Proxy = Local service router on each VM (Experimental): Manages local container lifecycle, Docker socket integration, zero-downtime container swaps, and local ACME SSL certificate provisioning.</w:t>
+      </w:r>
+    </w:p>
+    <w:p>
+      <w:pPr>
+        <w:spacing w:after="100" w:before="80"/>
+      </w:pPr>
+      <w:r/>
     </w:p>
     <w:p>
       <w:pPr>
         <w:spacing w:after="120" w:before="0"/>
       </w:pPr>
-    </w:p>
-    <w:p>
-      <w:pPr>
-        <w:spacing w:after="100" w:before="80"/>
-      </w:pPr>
-      <w:r>
-        <w:rPr>
-          <w:rFonts w:ascii="Calibri" w:cs="Calibri" w:eastAsia="Calibri" w:hAnsi="Calibri"/>
-          <w:b w:val="false"/>
-          <w:bCs w:val="false"/>
-          <w:i w:val="false"/>
-          <w:iCs w:val="false"/>
-          <w:color w:val="0F172A"/>
-          <w:sz w:val="22"/>
-          <w:szCs w:val="22"/>
-        </w:rPr>
-        <w:t>Nginx compatibility is automatic — Nginx is just a backend from Bridge's perspective. A service running behind Nginx on Node B is registered as node-b:80 or node-b:443. Bridge proxies to it. No special integration needed.</w:t>
-      </w:r>
-    </w:p>
-    <w:p>
-      <w:pPr>
-        <w:spacing w:after="120" w:before="0"/>
-      </w:pPr>
+      <w:r/>
+      <w:r>
+        <w:rPr>
+          <w:rFonts w:ascii="Courier New" w:hAnsi="Courier New"/>
+          <w:b w:val="0"/>
+          <w:i w:val="0"/>
+          <w:sz w:val="18"/>
+        </w:rPr>
+        <w:t xml:space="preserve">  Bridge (global entry-point / traffic router)</w:t>
+        <w:br/>
+        <w:t xml:space="preserve">  Knows: which domain belongs to which VM (Domain Registry)</w:t>
+        <w:br/>
+        <w:t xml:space="preserve">         │</w:t>
+        <w:br/>
+        <w:t xml:space="preserve">         ├── VM-03:443 → Coolify proxy → app container (app.example.com)</w:t>
+        <w:br/>
+        <w:t xml:space="preserve">         │               (Coolify manages local SSL &amp; container routing)</w:t>
+        <w:br/>
+        <w:t xml:space="preserve">         │</w:t>
+        <w:br/>
+        <w:t xml:space="preserve">         ├── VM-07:443 → Coolify proxy → api container (api.example.com)</w:t>
+        <w:br/>
+        <w:t xml:space="preserve">         │               (Coolify manages local SSL &amp; container routing)</w:t>
+        <w:br/>
+        <w:t xml:space="preserve">         │</w:t>
+        <w:br/>
+        <w:t xml:space="preserve">         └── VM-12:8080 → Bare service (Direct Mode fallback)</w:t>
+      </w:r>
     </w:p>
     <w:p>
       <w:pPr>
@@ -7229,31 +7263,11 @@
         <w:spacing w:after="120" w:before="120"/>
         <w:ind w:left="360" w:right="360"/>
       </w:pPr>
-      <w:r>
-        <w:rPr>
-          <w:rFonts w:ascii="Calibri" w:cs="Calibri" w:eastAsia="Calibri" w:hAnsi="Calibri"/>
-          <w:b/>
-          <w:bCs/>
-          <w:color w:val="B45309"/>
-          <w:sz w:val="20"/>
-          <w:szCs w:val="20"/>
-        </w:rPr>
-        <w:t xml:space="preserve">⚠ OPEN QUESTION  </w:t>
-      </w:r>
-      <w:r>
-        <w:rPr>
-          <w:rFonts w:ascii="Calibri" w:cs="Calibri" w:eastAsia="Calibri" w:hAnsi="Calibri"/>
-          <w:i/>
-          <w:iCs/>
-          <w:color w:val="B45309"/>
-          <w:sz w:val="20"/>
-          <w:szCs w:val="20"/>
-        </w:rPr>
-        <w:t>Coolify PR scope: the gossip integration could be as simple as a webhook that Coolify fires on service deploy/remove — Bridge listens on a local HTTP endpoint and injects the event into gossip. Or it could be a deeper integration where Coolify ships with a Bridge agent embedded. The webhook approach is far easier to get merged as it requires minimal changes to Coolify's codebase. Need to assess Coolify's contribution guidelines and preferred integration patterns before designing this.</w:t>
-      </w:r>
-    </w:p>
-    <w:p>
-      <w:pPr>
+      <w:r/>
+    </w:p>
+    <w:p>
+      <w:pPr>
+        <w:pStyle w:val="Heading3"/>
         <w:pBdr>
           <w:left w:val="thick" w:color="1D4ED8" w:sz="12"/>
         </w:pBdr>
@@ -7261,390 +7275,409 @@
         <w:spacing w:after="120" w:before="120"/>
         <w:ind w:left="360" w:right="360"/>
       </w:pPr>
-      <w:r>
-        <w:rPr>
-          <w:rFonts w:ascii="Calibri" w:cs="Calibri" w:eastAsia="Calibri" w:hAnsi="Calibri"/>
+      <w:r/>
+      <w:r>
+        <w:rPr>
+          <w:rFonts w:ascii="Calibri" w:hAnsi="Calibri"/>
           <w:b/>
-          <w:bCs/>
-          <w:color w:val="1D4ED8"/>
+          <w:i w:val="0"/>
+          <w:color w:val="13678A"/>
+          <w:sz w:val="26"/>
+        </w:rPr>
+        <w:t>3.6.4 Domain Registry &amp; Routing Table</w:t>
+      </w:r>
+    </w:p>
+    <w:p>
+      <w:pPr>
+        <w:spacing w:after="240" w:before="0"/>
+      </w:pPr>
+      <w:r/>
+      <w:r>
+        <w:rPr>
+          <w:rFonts w:ascii="Calibri" w:hAnsi="Calibri"/>
+          <w:b w:val="0"/>
+          <w:i w:val="0"/>
+          <w:sz w:val="22"/>
+        </w:rPr>
+        <w:t>The domain registry maintains mappings from fully qualified domain names to destination VM/node identifiers:</w:t>
+      </w:r>
+    </w:p>
+    <w:p>
+      <w:pPr>
+        <w:spacing w:after="120" w:before="360"/>
+      </w:pPr>
+      <w:r/>
+      <w:r>
+        <w:rPr>
+          <w:rFonts w:ascii="Courier New" w:hAnsi="Courier New"/>
+          <w:b w:val="0"/>
+          <w:i w:val="0"/>
+          <w:sz w:val="18"/>
+        </w:rPr>
+        <w:t xml:space="preserve">  app.example.com  → VM-03</w:t>
+        <w:br/>
+        <w:t xml:space="preserve">  api.example.com  → VM-07</w:t>
+        <w:br/>
+        <w:t xml:space="preserve">  auth.example.com → VM-02</w:t>
+      </w:r>
+    </w:p>
+    <w:p>
+      <w:pPr>
+        <w:spacing w:after="100" w:before="80"/>
+      </w:pPr>
+      <w:r/>
+      <w:r>
+        <w:rPr>
+          <w:rFonts w:ascii="Calibri" w:hAnsi="Calibri"/>
+          <w:b w:val="0"/>
+          <w:i w:val="0"/>
+          <w:sz w:val="22"/>
+        </w:rPr>
+        <w:t>These domain mappings are gossiped across all Bridge daemons via SWIM gossip, allowing whichever node is currently elected leader to route incoming SNI connections instantly without cross-node lookup latency.</w:t>
+      </w:r>
+    </w:p>
+    <w:p>
+      <w:pPr>
+        <w:spacing w:after="120" w:before="0"/>
+      </w:pPr>
+      <w:r/>
+    </w:p>
+    <w:p>
+      <w:pPr>
+        <w:pStyle w:val="Heading3"/>
+        <w:shd w:fill="F1F5F9" w:val="clear"/>
+        <w:spacing w:after="30" w:before="30"/>
+        <w:ind w:left="360"/>
+      </w:pPr>
+      <w:r/>
+      <w:r>
+        <w:rPr>
+          <w:rFonts w:ascii="Calibri" w:hAnsi="Calibri"/>
+          <w:b/>
+          <w:i w:val="0"/>
+          <w:color w:val="13678A"/>
+          <w:sz w:val="26"/>
+        </w:rPr>
+        <w:t>3.6.5 Coolify &amp; Nginx Compatibility &amp; Planned PR</w:t>
+      </w:r>
+    </w:p>
+    <w:p>
+      <w:pPr>
+        <w:shd w:fill="F1F5F9" w:val="clear"/>
+        <w:spacing w:after="30" w:before="30"/>
+        <w:ind w:left="360"/>
+      </w:pPr>
+      <w:r/>
+      <w:r>
+        <w:rPr>
+          <w:rFonts w:ascii="Calibri" w:hAnsi="Calibri"/>
+          <w:b w:val="0"/>
+          <w:i w:val="0"/>
+          <w:sz w:val="22"/>
+        </w:rPr>
+        <w:t>Planned Coolify PR: A pull request to Coolify to add native gossip mesh support — so Coolify automatically registers its services with a Bridge peer on the same node without manual configuration. The integration point is the gossip layer only.</w:t>
+      </w:r>
+    </w:p>
+    <w:p>
+      <w:pPr>
+        <w:pStyle w:val="ListParagraph"/>
+        <w:shd w:fill="F1F5F9" w:val="clear"/>
+        <w:spacing w:after="30" w:before="30"/>
+        <w:ind w:left="360"/>
+      </w:pPr>
+      <w:r/>
+      <w:r>
+        <w:rPr>
+          <w:rFonts w:ascii="Calibri" w:hAnsi="Calibri"/>
+          <w:b w:val="0"/>
+          <w:i w:val="0"/>
+          <w:sz w:val="22"/>
+        </w:rPr>
+        <w:t>•  Coolify registers services → Bridge gossip → all peers learn the domain route</w:t>
+      </w:r>
+    </w:p>
+    <w:p>
+      <w:pPr>
+        <w:pStyle w:val="ListParagraph"/>
+        <w:shd w:fill="F1F5F9" w:val="clear"/>
+        <w:spacing w:after="30" w:before="30"/>
+        <w:ind w:left="360"/>
+      </w:pPr>
+      <w:r/>
+      <w:r>
+        <w:rPr>
+          <w:rFonts w:ascii="Calibri" w:hAnsi="Calibri"/>
+          <w:b w:val="0"/>
+          <w:i w:val="0"/>
+          <w:sz w:val="22"/>
+        </w:rPr>
+        <w:t>•  Coolify removes a service → Bridge gossip → all peers remove the domain route</w:t>
+      </w:r>
+    </w:p>
+    <w:p>
+      <w:pPr>
+        <w:pStyle w:val="ListParagraph"/>
+        <w:shd w:fill="F1F5F9" w:val="clear"/>
+        <w:spacing w:after="30" w:before="30"/>
+        <w:ind w:left="360"/>
+      </w:pPr>
+      <w:r/>
+      <w:r>
+        <w:rPr>
+          <w:rFonts w:ascii="Calibri" w:hAnsi="Calibri"/>
+          <w:b w:val="0"/>
+          <w:i w:val="0"/>
+          <w:sz w:val="22"/>
+        </w:rPr>
+        <w:t>•  No change to Coolify's internal proxy — it still handles node-level routing</w:t>
+      </w:r>
+    </w:p>
+    <w:p>
+      <w:pPr>
+        <w:pStyle w:val="ListParagraph"/>
+        <w:shd w:fill="F1F5F9" w:val="clear"/>
+        <w:spacing w:after="30" w:before="30"/>
+        <w:ind w:left="360"/>
+      </w:pPr>
+      <w:r/>
+      <w:r>
+        <w:rPr>
+          <w:rFonts w:ascii="Calibri" w:hAnsi="Calibri"/>
+          <w:b w:val="0"/>
+          <w:i w:val="0"/>
+          <w:sz w:val="22"/>
+        </w:rPr>
+        <w:t>•  Bridge handles fleet-level routing — which node owns the domain</w:t>
+      </w:r>
+    </w:p>
+    <w:p>
+      <w:pPr>
+        <w:shd w:fill="F1F5F9" w:val="clear"/>
+        <w:spacing w:after="30" w:before="30"/>
+        <w:ind w:left="360"/>
+      </w:pPr>
+      <w:r/>
+      <w:r>
+        <w:rPr>
+          <w:rFonts w:ascii="Calibri" w:hAnsi="Calibri"/>
+          <w:b w:val="0"/>
+          <w:i w:val="0"/>
+          <w:sz w:val="22"/>
+        </w:rPr>
+        <w:t>Nginx compatibility is automatic — Nginx is just another backend proxy from Bridge's perspective. A service behind Nginx on Node B is registered as node-b:443. Bridge routes SNI passthrough directly to it.</w:t>
+      </w:r>
+    </w:p>
+    <w:p>
+      <w:pPr>
+        <w:shd w:fill="F1F5F9" w:val="clear"/>
+        <w:spacing w:after="30" w:before="30"/>
+        <w:ind w:left="360"/>
+      </w:pPr>
+      <w:r/>
+      <w:r>
+        <w:rPr>
+          <w:rFonts w:ascii="Calibri" w:hAnsi="Calibri"/>
+          <w:b/>
+          <w:i w:val="0"/>
+          <w:color w:val="B8860B"/>
           <w:sz w:val="20"/>
-          <w:szCs w:val="20"/>
+        </w:rPr>
+        <w:t xml:space="preserve">⚠ OPEN QUESTION  </w:t>
+      </w:r>
+      <w:r>
+        <w:rPr>
+          <w:rFonts w:ascii="Calibri" w:hAnsi="Calibri"/>
+          <w:b w:val="0"/>
+          <w:i/>
+          <w:sz w:val="20"/>
+        </w:rPr>
+        <w:t>Coolify PR scope: the gossip integration could be as simple as a webhook that Coolify fires on service deploy/remove — Bridge listens on a local HTTP endpoint and injects the event into gossip. Or it could be a deeper integration where Coolify ships with a Bridge agent embedded. The webhook approach is far easier to get merged as it requires minimal changes to Coolify's codebase.</w:t>
+      </w:r>
+    </w:p>
+    <w:p>
+      <w:pPr>
+        <w:shd w:fill="F1F5F9" w:val="clear"/>
+        <w:spacing w:after="30" w:before="30"/>
+        <w:ind w:left="360"/>
+      </w:pPr>
+      <w:r/>
+      <w:r>
+        <w:rPr>
+          <w:rFonts w:ascii="Calibri" w:hAnsi="Calibri"/>
+          <w:b/>
+          <w:i w:val="0"/>
+          <w:color w:val="13678A"/>
+          <w:sz w:val="20"/>
         </w:rPr>
         <w:t xml:space="preserve">📖 RESEARCH  </w:t>
       </w:r>
       <w:r>
         <w:rPr>
-          <w:rFonts w:ascii="Calibri" w:cs="Calibri" w:eastAsia="Calibri" w:hAnsi="Calibri"/>
-          <w:color w:val="1D4ED8"/>
+          <w:rFonts w:ascii="Calibri" w:hAnsi="Calibri"/>
+          <w:b w:val="0"/>
+          <w:i w:val="0"/>
           <w:sz w:val="20"/>
-          <w:szCs w:val="20"/>
-        </w:rPr>
-        <w:t xml:space="preserve">Coolify source — github.com/coollabsio/coolify. Look at how Coolify currently handles service registration and proxy config generation to identify the cleanest integration point for gossip events.</w:t>
-      </w:r>
-    </w:p>
-    <w:p>
-      <w:pPr>
-        <w:spacing w:after="240" w:before="0"/>
-      </w:pPr>
+        </w:rPr>
+        <w:t>Coolify source — github.com/coollabsio/coolify. Look at how Coolify currently handles service registration and proxy config generation to identify the cleanest integration point for gossip events.</w:t>
+      </w:r>
+    </w:p>
+    <w:p>
+      <w:pPr>
+        <w:shd w:fill="F1F5F9" w:val="clear"/>
+        <w:spacing w:after="30" w:before="30"/>
+        <w:ind w:left="360"/>
+      </w:pPr>
+      <w:r/>
     </w:p>
     <w:p>
       <w:pPr>
         <w:pStyle w:val="Heading2"/>
-        <w:spacing w:after="120" w:before="360"/>
-      </w:pPr>
-      <w:r>
-        <w:rPr>
-          <w:rFonts w:ascii="Calibri" w:cs="Calibri" w:eastAsia="Calibri" w:hAnsi="Calibri"/>
+        <w:shd w:fill="F1F5F9" w:val="clear"/>
+        <w:spacing w:after="30" w:before="30"/>
+        <w:ind w:left="360"/>
+      </w:pPr>
+      <w:r/>
+      <w:r>
+        <w:rPr>
+          <w:rFonts w:ascii="Calibri" w:hAnsi="Calibri"/>
           <w:b/>
-          <w:bCs/>
-          <w:color w:val="6366F1"/>
-          <w:sz w:val="34"/>
-          <w:szCs w:val="34"/>
-        </w:rPr>
-        <w:t xml:space="preserve">3.6 Consistent Hashing — Load Distribution</w:t>
+          <w:i w:val="0"/>
+          <w:color w:val="0B2545"/>
+          <w:sz w:val="32"/>
+        </w:rPr>
+        <w:t>3.7 Consistent Hashing — Load Distribution</w:t>
+      </w:r>
+    </w:p>
+    <w:p>
+      <w:pPr>
+        <w:shd w:fill="F1F5F9" w:val="clear"/>
+        <w:spacing w:after="30" w:before="30"/>
+        <w:ind w:left="360"/>
+      </w:pPr>
+      <w:r/>
+      <w:r>
+        <w:rPr>
+          <w:rFonts w:ascii="Calibri" w:hAnsi="Calibri"/>
+          <w:b w:val="0"/>
+          <w:i w:val="0"/>
+          <w:sz w:val="22"/>
+        </w:rPr>
+        <w:t>When multiple instances of the same service run across different nodes — for redundancy or horizontal scaling — the router must distribute requests across them. Consistent hashing is used instead of naive round-robin:</w:t>
+      </w:r>
+    </w:p>
+    <w:p>
+      <w:pPr>
+        <w:shd w:fill="F1F5F9" w:val="clear"/>
+        <w:spacing w:after="30" w:before="30"/>
+        <w:ind w:left="360"/>
+      </w:pPr>
+      <w:r/>
+      <w:r>
+        <w:rPr>
+          <w:rFonts w:ascii="Courier New" w:hAnsi="Courier New"/>
+          <w:b w:val="0"/>
+          <w:i w:val="0"/>
+          <w:sz w:val="18"/>
+        </w:rPr>
+        <w:t xml:space="preserve">  Hash ring (360 virtual nodes / tokens)</w:t>
+        <w:br/>
+        <w:br/>
+        <w:t xml:space="preserve">          svc-api:node-A (tokens: 0, 120, 240)</w:t>
+        <w:br/>
+        <w:t xml:space="preserve">         /                                    \</w:t>
+        <w:br/>
+        <w:t xml:space="preserve">        /                                      \</w:t>
+        <w:br/>
+        <w:t xml:space="preserve">  request hash                          svc-api:node-C</w:t>
+        <w:br/>
+        <w:t xml:space="preserve">  maps to nearest                       (tokens: 80, 200, 320)</w:t>
+        <w:br/>
+        <w:t xml:space="preserve">  token clockwise                              |</w:t>
+        <w:br/>
+        <w:t xml:space="preserve">        \                                      /</w:t>
+        <w:br/>
+        <w:t xml:space="preserve">         \                                    /</w:t>
+        <w:br/>
+        <w:t xml:space="preserve">          svc-api:node-B (tokens: 40, 160, 280)</w:t>
+        <w:br/>
+        <w:br/>
+        <w:t xml:space="preserve">  Property: when a backend is added or removed,</w:t>
+        <w:br/>
+        <w:t xml:space="preserve">  only 1/n of keys are remapped (not all of them)</w:t>
+      </w:r>
+    </w:p>
+    <w:p>
+      <w:pPr>
+        <w:shd w:fill="F1F5F9" w:val="clear"/>
+        <w:spacing w:after="30" w:before="30"/>
+        <w:ind w:left="360"/>
+      </w:pPr>
+      <w:r/>
+      <w:r>
+        <w:rPr>
+          <w:rFonts w:ascii="Calibri" w:hAnsi="Calibri"/>
+          <w:b w:val="0"/>
+          <w:i w:val="0"/>
+          <w:sz w:val="22"/>
+        </w:rPr>
+        <w:t>Request key for hashing: SHA256(source_ip + hostname). This gives session affinity — the same client consistently hits the same backend — without explicit session tracking.</w:t>
+      </w:r>
+    </w:p>
+    <w:p>
+      <w:pPr>
+        <w:spacing w:after="120" w:before="0"/>
+      </w:pPr>
+      <w:r/>
+      <w:r>
+        <w:rPr>
+          <w:rFonts w:ascii="Calibri" w:hAnsi="Calibri"/>
+          <w:b/>
+          <w:i w:val="0"/>
+          <w:color w:val="B8860B"/>
+          <w:sz w:val="20"/>
+        </w:rPr>
+        <w:t xml:space="preserve">⚠ OPEN QUESTION  </w:t>
+      </w:r>
+      <w:r>
+        <w:rPr>
+          <w:rFonts w:ascii="Calibri" w:hAnsi="Calibri"/>
+          <w:b w:val="0"/>
+          <w:i/>
+          <w:sz w:val="20"/>
+        </w:rPr>
+        <w:t>Session affinity via consistent hashing breaks when a backend fails and its tokens are redistributed. Clients that were hashing to that backend now hash to a different one — their session state (if any) is lost. For stateless services this is fine. For stateful services the application needs to handle this. Should Bridge document this limitation explicitly and leave stateful session handling to the application layer?</w:t>
       </w:r>
     </w:p>
     <w:p>
       <w:pPr>
         <w:spacing w:after="100" w:before="80"/>
       </w:pPr>
-      <w:r>
-        <w:rPr>
-          <w:rFonts w:ascii="Calibri" w:cs="Calibri" w:eastAsia="Calibri" w:hAnsi="Calibri"/>
-          <w:b w:val="false"/>
-          <w:bCs w:val="false"/>
-          <w:i w:val="false"/>
-          <w:iCs w:val="false"/>
-          <w:color w:val="0F172A"/>
-          <w:sz w:val="22"/>
-          <w:szCs w:val="22"/>
-        </w:rPr>
-        <w:t xml:space="preserve">When multiple instances of the same service run across different nodes — for redundancy or horizontal scaling — the router must distribute requests across them. Consistent hashing is used instead of naive round-robin.</w:t>
+      <w:r/>
+      <w:r>
+        <w:rPr>
+          <w:rFonts w:ascii="Calibri" w:hAnsi="Calibri"/>
+          <w:b/>
+          <w:i w:val="0"/>
+          <w:color w:val="13678A"/>
+          <w:sz w:val="20"/>
+        </w:rPr>
+        <w:t xml:space="preserve">📖 RESEARCH  </w:t>
+      </w:r>
+      <w:r>
+        <w:rPr>
+          <w:rFonts w:ascii="Calibri" w:hAnsi="Calibri"/>
+          <w:b w:val="0"/>
+          <w:i w:val="0"/>
+          <w:sz w:val="20"/>
+        </w:rPr>
+        <w:t>The original consistent hashing paper: "Consistent Hashing and Random Trees" — Karger et al. (1997). Also look at Jump Consistent Hash (Lamping &amp; Veach, 2014) — simpler to implement, better load distribution, but does not support arbitrary node removal (only removal from the end).</w:t>
       </w:r>
     </w:p>
     <w:p>
       <w:pPr>
         <w:spacing w:after="120" w:before="0"/>
       </w:pPr>
-    </w:p>
-    <w:p>
-      <w:pPr>
-        <w:shd w:fill="F1F5F9" w:val="clear"/>
-        <w:spacing w:after="30" w:before="30"/>
-        <w:ind w:left="360"/>
-      </w:pPr>
-      <w:r>
-        <w:rPr>
-          <w:rFonts w:ascii="Courier New" w:cs="Courier New" w:eastAsia="Courier New" w:hAnsi="Courier New"/>
-          <w:color w:val="1E293B"/>
-          <w:sz w:val="18"/>
-          <w:szCs w:val="18"/>
-        </w:rPr>
-        <w:t xml:space="preserve">  Hash ring (360 virtual nodes / tokens)</w:t>
-      </w:r>
-    </w:p>
-    <w:p>
-      <w:pPr>
-        <w:shd w:fill="F1F5F9" w:val="clear"/>
-        <w:spacing w:after="30" w:before="30"/>
-        <w:ind w:left="360"/>
-      </w:pPr>
-      <w:r>
-        <w:rPr>
-          <w:rFonts w:ascii="Courier New" w:cs="Courier New" w:eastAsia="Courier New" w:hAnsi="Courier New"/>
-          <w:color w:val="1E293B"/>
-          <w:sz w:val="18"/>
-          <w:szCs w:val="18"/>
-        </w:rPr>
-        <w:t xml:space="preserve"/>
-      </w:r>
-    </w:p>
-    <w:p>
-      <w:pPr>
-        <w:shd w:fill="F1F5F9" w:val="clear"/>
-        <w:spacing w:after="30" w:before="30"/>
-        <w:ind w:left="360"/>
-      </w:pPr>
-      <w:r>
-        <w:rPr>
-          <w:rFonts w:ascii="Courier New" w:cs="Courier New" w:eastAsia="Courier New" w:hAnsi="Courier New"/>
-          <w:color w:val="1E293B"/>
-          <w:sz w:val="18"/>
-          <w:szCs w:val="18"/>
-        </w:rPr>
-        <w:t xml:space="preserve">          svc-api:node-A (tokens: 0, 120, 240)</w:t>
-      </w:r>
-    </w:p>
-    <w:p>
-      <w:pPr>
-        <w:shd w:fill="F1F5F9" w:val="clear"/>
-        <w:spacing w:after="30" w:before="30"/>
-        <w:ind w:left="360"/>
-      </w:pPr>
-      <w:r>
-        <w:rPr>
-          <w:rFonts w:ascii="Courier New" w:cs="Courier New" w:eastAsia="Courier New" w:hAnsi="Courier New"/>
-          <w:color w:val="1E293B"/>
-          <w:sz w:val="18"/>
-          <w:szCs w:val="18"/>
-        </w:rPr>
-        <w:t xml:space="preserve">         /                                    \</w:t>
-      </w:r>
-    </w:p>
-    <w:p>
-      <w:pPr>
-        <w:shd w:fill="F1F5F9" w:val="clear"/>
-        <w:spacing w:after="30" w:before="30"/>
-        <w:ind w:left="360"/>
-      </w:pPr>
-      <w:r>
-        <w:rPr>
-          <w:rFonts w:ascii="Courier New" w:cs="Courier New" w:eastAsia="Courier New" w:hAnsi="Courier New"/>
-          <w:color w:val="1E293B"/>
-          <w:sz w:val="18"/>
-          <w:szCs w:val="18"/>
-        </w:rPr>
-        <w:t xml:space="preserve">        /                                      \</w:t>
-      </w:r>
-    </w:p>
-    <w:p>
-      <w:pPr>
-        <w:shd w:fill="F1F5F9" w:val="clear"/>
-        <w:spacing w:after="30" w:before="30"/>
-        <w:ind w:left="360"/>
-      </w:pPr>
-      <w:r>
-        <w:rPr>
-          <w:rFonts w:ascii="Courier New" w:cs="Courier New" w:eastAsia="Courier New" w:hAnsi="Courier New"/>
-          <w:color w:val="1E293B"/>
-          <w:sz w:val="18"/>
-          <w:szCs w:val="18"/>
-        </w:rPr>
-        <w:t xml:space="preserve">  request hash                          svc-api:node-C</w:t>
-      </w:r>
-    </w:p>
-    <w:p>
-      <w:pPr>
-        <w:shd w:fill="F1F5F9" w:val="clear"/>
-        <w:spacing w:after="30" w:before="30"/>
-        <w:ind w:left="360"/>
-      </w:pPr>
-      <w:r>
-        <w:rPr>
-          <w:rFonts w:ascii="Courier New" w:cs="Courier New" w:eastAsia="Courier New" w:hAnsi="Courier New"/>
-          <w:color w:val="1E293B"/>
-          <w:sz w:val="18"/>
-          <w:szCs w:val="18"/>
-        </w:rPr>
-        <w:t xml:space="preserve">  maps to nearest                       (tokens: 80, 200, 320)</w:t>
-      </w:r>
-    </w:p>
-    <w:p>
-      <w:pPr>
-        <w:shd w:fill="F1F5F9" w:val="clear"/>
-        <w:spacing w:after="30" w:before="30"/>
-        <w:ind w:left="360"/>
-      </w:pPr>
-      <w:r>
-        <w:rPr>
-          <w:rFonts w:ascii="Courier New" w:cs="Courier New" w:eastAsia="Courier New" w:hAnsi="Courier New"/>
-          <w:color w:val="1E293B"/>
-          <w:sz w:val="18"/>
-          <w:szCs w:val="18"/>
-        </w:rPr>
-        <w:t xml:space="preserve">  token clockwise                              |</w:t>
-      </w:r>
-    </w:p>
-    <w:p>
-      <w:pPr>
-        <w:shd w:fill="F1F5F9" w:val="clear"/>
-        <w:spacing w:after="30" w:before="30"/>
-        <w:ind w:left="360"/>
-      </w:pPr>
-      <w:r>
-        <w:rPr>
-          <w:rFonts w:ascii="Courier New" w:cs="Courier New" w:eastAsia="Courier New" w:hAnsi="Courier New"/>
-          <w:color w:val="1E293B"/>
-          <w:sz w:val="18"/>
-          <w:szCs w:val="18"/>
-        </w:rPr>
-        <w:t xml:space="preserve">        \                                      /</w:t>
-      </w:r>
-    </w:p>
-    <w:p>
-      <w:pPr>
-        <w:shd w:fill="F1F5F9" w:val="clear"/>
-        <w:spacing w:after="30" w:before="30"/>
-        <w:ind w:left="360"/>
-      </w:pPr>
-      <w:r>
-        <w:rPr>
-          <w:rFonts w:ascii="Courier New" w:cs="Courier New" w:eastAsia="Courier New" w:hAnsi="Courier New"/>
-          <w:color w:val="1E293B"/>
-          <w:sz w:val="18"/>
-          <w:szCs w:val="18"/>
-        </w:rPr>
-        <w:t xml:space="preserve">         \                                    /</w:t>
-      </w:r>
-    </w:p>
-    <w:p>
-      <w:pPr>
-        <w:shd w:fill="F1F5F9" w:val="clear"/>
-        <w:spacing w:after="30" w:before="30"/>
-        <w:ind w:left="360"/>
-      </w:pPr>
-      <w:r>
-        <w:rPr>
-          <w:rFonts w:ascii="Courier New" w:cs="Courier New" w:eastAsia="Courier New" w:hAnsi="Courier New"/>
-          <w:color w:val="1E293B"/>
-          <w:sz w:val="18"/>
-          <w:szCs w:val="18"/>
-        </w:rPr>
-        <w:t xml:space="preserve">          svc-api:node-B (tokens: 40, 160, 280)</w:t>
-      </w:r>
-    </w:p>
-    <w:p>
-      <w:pPr>
-        <w:shd w:fill="F1F5F9" w:val="clear"/>
-        <w:spacing w:after="30" w:before="30"/>
-        <w:ind w:left="360"/>
-      </w:pPr>
-      <w:r>
-        <w:rPr>
-          <w:rFonts w:ascii="Courier New" w:cs="Courier New" w:eastAsia="Courier New" w:hAnsi="Courier New"/>
-          <w:color w:val="1E293B"/>
-          <w:sz w:val="18"/>
-          <w:szCs w:val="18"/>
-        </w:rPr>
-        <w:t xml:space="preserve"/>
-      </w:r>
-    </w:p>
-    <w:p>
-      <w:pPr>
-        <w:shd w:fill="F1F5F9" w:val="clear"/>
-        <w:spacing w:after="30" w:before="30"/>
-        <w:ind w:left="360"/>
-      </w:pPr>
-      <w:r>
-        <w:rPr>
-          <w:rFonts w:ascii="Courier New" w:cs="Courier New" w:eastAsia="Courier New" w:hAnsi="Courier New"/>
-          <w:color w:val="1E293B"/>
-          <w:sz w:val="18"/>
-          <w:szCs w:val="18"/>
-        </w:rPr>
-        <w:t xml:space="preserve">  Property: when a backend is added or removed,</w:t>
-      </w:r>
-    </w:p>
-    <w:p>
-      <w:pPr>
-        <w:shd w:fill="F1F5F9" w:val="clear"/>
-        <w:spacing w:after="30" w:before="30"/>
-        <w:ind w:left="360"/>
-      </w:pPr>
-      <w:r>
-        <w:rPr>
-          <w:rFonts w:ascii="Courier New" w:cs="Courier New" w:eastAsia="Courier New" w:hAnsi="Courier New"/>
-          <w:color w:val="1E293B"/>
-          <w:sz w:val="18"/>
-          <w:szCs w:val="18"/>
-        </w:rPr>
-        <w:t xml:space="preserve">  only 1/n of keys are remapped (not all of them)</w:t>
-      </w:r>
-    </w:p>
-    <w:p>
-      <w:pPr>
-        <w:spacing w:after="120" w:before="0"/>
-      </w:pPr>
-    </w:p>
-    <w:p>
-      <w:pPr>
-        <w:spacing w:after="100" w:before="80"/>
-      </w:pPr>
-      <w:r>
-        <w:rPr>
-          <w:rFonts w:ascii="Calibri" w:cs="Calibri" w:eastAsia="Calibri" w:hAnsi="Calibri"/>
-          <w:b w:val="false"/>
-          <w:bCs w:val="false"/>
-          <w:i w:val="false"/>
-          <w:iCs w:val="false"/>
-          <w:color w:val="0F172A"/>
-          <w:sz w:val="22"/>
-          <w:szCs w:val="22"/>
-        </w:rPr>
-        <w:t xml:space="preserve">Request key for hashing: SHA256(source_ip + hostname). This gives session affinity — the same client consistently hits the same backend — without explicit session tracking.</w:t>
-      </w:r>
-    </w:p>
-    <w:p>
-      <w:pPr>
-        <w:spacing w:after="120" w:before="0"/>
-      </w:pPr>
-    </w:p>
-    <w:p>
-      <w:pPr>
-        <w:pBdr>
-          <w:left w:val="thick" w:color="B45309" w:sz="12"/>
-        </w:pBdr>
-        <w:shd w:fill="FFFBEB" w:val="clear"/>
-        <w:spacing w:after="120" w:before="120"/>
-        <w:ind w:left="360" w:right="360"/>
-      </w:pPr>
-      <w:r>
-        <w:rPr>
-          <w:rFonts w:ascii="Calibri" w:cs="Calibri" w:eastAsia="Calibri" w:hAnsi="Calibri"/>
-          <w:b/>
-          <w:bCs/>
-          <w:color w:val="B45309"/>
-          <w:sz w:val="20"/>
-          <w:szCs w:val="20"/>
-        </w:rPr>
-        <w:t xml:space="preserve">⚠ OPEN QUESTION  </w:t>
-      </w:r>
-      <w:r>
-        <w:rPr>
-          <w:rFonts w:ascii="Calibri" w:cs="Calibri" w:eastAsia="Calibri" w:hAnsi="Calibri"/>
-          <w:i/>
-          <w:iCs/>
-          <w:color w:val="B45309"/>
-          <w:sz w:val="20"/>
-          <w:szCs w:val="20"/>
-        </w:rPr>
-        <w:t>Session affinity via consistent hashing breaks when a backend fails and its tokens are redistributed. Clients that were hashing to that backend now hash to a different one — their session state (if any) is lost. For stateless services this is fine. For stateful services the application needs to handle this. Should Bridge document this limitation explicitly and leave stateful session handling to the application layer?</w:t>
-      </w:r>
-    </w:p>
-    <w:p>
-      <w:pPr>
-        <w:pBdr>
-          <w:left w:val="thick" w:color="1D4ED8" w:sz="12"/>
-        </w:pBdr>
-        <w:shd w:fill="EFF6FF" w:val="clear"/>
-        <w:spacing w:after="120" w:before="120"/>
-        <w:ind w:left="360" w:right="360"/>
-      </w:pPr>
-      <w:r>
-        <w:rPr>
-          <w:rFonts w:ascii="Calibri" w:cs="Calibri" w:eastAsia="Calibri" w:hAnsi="Calibri"/>
-          <w:b/>
-          <w:bCs/>
-          <w:color w:val="1D4ED8"/>
-          <w:sz w:val="20"/>
-          <w:szCs w:val="20"/>
-        </w:rPr>
-        <w:t xml:space="preserve">📖 RESEARCH  </w:t>
-      </w:r>
-      <w:r>
-        <w:rPr>
-          <w:rFonts w:ascii="Calibri" w:cs="Calibri" w:eastAsia="Calibri" w:hAnsi="Calibri"/>
-          <w:color w:val="1D4ED8"/>
-          <w:sz w:val="20"/>
-          <w:szCs w:val="20"/>
-        </w:rPr>
-        <w:t xml:space="preserve">The original consistent hashing paper: "Consistent Hashing and Random Trees" — Karger et al. (1997). Also look at Jump Consistent Hash (Lamping &amp; Veach, 2014) — simpler to implement, better load distribution, but does not support arbitrary node removal (only removal from the end). May not be suitable here since nodes can leave at any time.</w:t>
-      </w:r>
-    </w:p>
-    <w:p>
-      <w:pPr>
-        <w:spacing w:after="240" w:before="0"/>
-      </w:pPr>
+      <w:r/>
     </w:p>
     <w:p>
       <w:pPr>
@@ -9596,11 +9629,6 @@
     </w:tbl>
     <w:p>
       <w:pPr>
-        <w:spacing w:after="240" w:before="0"/>
-      </w:pPr>
-    </w:p>
-    <w:p>
-      <w:pPr>
         <w:pStyle w:val="Heading1"/>
         <w:spacing w:after="160" w:before="480"/>
       </w:pPr>
@@ -10787,12 +10815,51 @@
           </w:p>
         </w:tc>
       </w:tr>
+      <w:tr>
+        <w:tc>
+          <w:tcPr>
+            <w:tcW w:type="dxa" w:w="2000"/>
+          </w:tcPr>
+          <w:p>
+            <w:r>
+              <w:rPr>
+                <w:rFonts w:ascii="Calibri" w:hAnsi="Calibri"/>
+                <w:sz w:val="19"/>
+              </w:rPr>
+              <w:t>SNI L4 Router</w:t>
+            </w:r>
+          </w:p>
+        </w:tc>
+        <w:tc>
+          <w:tcPr>
+            <w:tcW w:type="dxa" w:w="2200"/>
+          </w:tcPr>
+          <w:p>
+            <w:r>
+              <w:rPr>
+                <w:rFonts w:ascii="Calibri" w:hAnsi="Calibri"/>
+                <w:sz w:val="19"/>
+              </w:rPr>
+              <w:t>tokio + ClientHello SNI parser</w:t>
+            </w:r>
+          </w:p>
+        </w:tc>
+        <w:tc>
+          <w:tcPr>
+            <w:tcW w:type="dxa" w:w="4200"/>
+          </w:tcPr>
+          <w:p>
+            <w:r>
+              <w:rPr>
+                <w:rFonts w:ascii="Calibri" w:hAnsi="Calibri"/>
+                <w:sz w:val="19"/>
+              </w:rPr>
+              <w:t>Zero-overhead L4 TCP passthrough in Handoff mode; extracts SNI without TLS termination</w:t>
+            </w:r>
+          </w:p>
+        </w:tc>
+      </w:tr>
     </w:tbl>
-    <w:p>
-      <w:pPr>
-        <w:spacing w:after="120" w:before="0"/>
-      </w:pPr>
-    </w:p>
     <w:p>
       <w:pPr>
         <w:pBdr>
@@ -11780,50 +11847,38 @@
       </w:pPr>
       <w:r>
         <w:rPr>
-          <w:rFonts w:ascii="Courier New" w:cs="Courier New" w:eastAsia="Courier New" w:hAnsi="Courier New"/>
-          <w:color w:val="1E293B"/>
-          <w:sz w:val="18"/>
-          <w:szCs w:val="18"/>
-        </w:rPr>
-        <w:t xml:space="preserve">[proxy]</w:t>
-      </w:r>
-    </w:p>
-    <w:p>
-      <w:pPr>
-        <w:shd w:fill="F1F5F9" w:val="clear"/>
-        <w:spacing w:after="30" w:before="30"/>
-        <w:ind w:left="360"/>
-      </w:pPr>
-      <w:r>
-        <w:rPr>
-          <w:rFonts w:ascii="Courier New" w:cs="Courier New" w:eastAsia="Courier New" w:hAnsi="Courier New"/>
-          <w:color w:val="1E293B"/>
-          <w:sz w:val="18"/>
-          <w:szCs w:val="18"/>
-        </w:rPr>
-        <w:t xml:space="preserve">listen = "0.0.0.0:443"</w:t>
-      </w:r>
-    </w:p>
-    <w:p>
-      <w:pPr>
-        <w:shd w:fill="F1F5F9" w:val="clear"/>
-        <w:spacing w:after="30" w:before="30"/>
-        <w:ind w:left="360"/>
-      </w:pPr>
-      <w:r>
-        <w:rPr>
-          <w:rFonts w:ascii="Courier New" w:cs="Courier New" w:eastAsia="Courier New" w:hAnsi="Courier New"/>
-          <w:color w:val="1E293B"/>
-          <w:sz w:val="18"/>
-          <w:szCs w:val="18"/>
-        </w:rPr>
-        <w:t xml:space="preserve">health_check_interval_s = 10</w:t>
-      </w:r>
-    </w:p>
-    <w:p>
-      <w:pPr>
-        <w:spacing w:after="240" w:before="0"/>
-      </w:pPr>
+          <w:rFonts w:ascii="Courier New" w:hAnsi="Courier New"/>
+          <w:b w:val="0"/>
+          <w:i w:val="0"/>
+          <w:sz w:val="18"/>
+        </w:rPr>
+        <w:t>[proxy]</w:t>
+        <w:br/>
+        <w:t>mode = "handoff"                 # "handoff" (default, SNI L4 router) | "direct" (L7 reverse proxy)</w:t>
+        <w:br/>
+        <w:t>listen = "0.0.0.0:443"</w:t>
+        <w:br/>
+        <w:t>health_check_interval_s = 10</w:t>
+        <w:br/>
+        <w:br/>
+        <w:t># Domain Registry (Maps inbound SNI domain to target VM peer)</w:t>
+        <w:br/>
+        <w:t>[domains]</w:t>
+        <w:br/>
+        <w:t>"app.example.com" = "vm-03"      # routes SNI app.example.com -&gt; VM-03:443</w:t>
+        <w:br/>
+        <w:t>"api.example.com" = "vm-07"      # routes SNI api.example.com -&gt; VM-07:443</w:t>
+        <w:br/>
+        <w:t>"dashboard.example.com" = "vm-03"</w:t>
+      </w:r>
+    </w:p>
+    <w:p>
+      <w:pPr>
+        <w:shd w:fill="F1F5F9" w:val="clear"/>
+        <w:spacing w:after="30" w:before="30"/>
+        <w:ind w:left="360"/>
+      </w:pPr>
+      <w:r/>
     </w:p>
     <w:p>
       <w:pPr>
@@ -12021,6 +12076,27 @@
           <w:szCs w:val="34"/>
         </w:rPr>
         <w:t xml:space="preserve">7.2 Important — Affects Implementation Quality</w:t>
+      </w:r>
+    </w:p>
+    <w:p>
+      <w:r>
+        <w:rPr>
+          <w:rFonts w:ascii="Calibri" w:hAnsi="Calibri"/>
+          <w:b/>
+          <w:i w:val="0"/>
+          <w:color w:val="B8860B"/>
+          <w:sz w:val="20"/>
+        </w:rPr>
+        <w:t xml:space="preserve">⚠ OPEN QUESTION  </w:t>
+      </w:r>
+      <w:r>
+        <w:rPr>
+          <w:rFonts w:ascii="Calibri" w:hAnsi="Calibri"/>
+          <w:b w:val="0"/>
+          <w:i/>
+          <w:sz w:val="20"/>
+        </w:rPr>
+        <w:t>Preserving client real IP in Handoff Mode: When Bridge forwards raw TCP streams to the VM's Coolify proxy over WireGuard, the Coolify proxy sees the source IP as Bridge's WireGuard IP (e.g. 10.8.0.1) rather than the real client IP. Should Bridge inject a PROXY Protocol v2 header before the ClientHello stream? Coolify/Traefik and Nginx support PROXY protocol, which allows preserving client IPs for rate-limiting, geo-blocking, and audit logging.</w:t>
       </w:r>
     </w:p>
     <w:p>
@@ -12694,11 +12770,6 @@
     </w:tbl>
     <w:p>
       <w:pPr>
-        <w:spacing w:after="120" w:before="0"/>
-      </w:pPr>
-    </w:p>
-    <w:p>
-      <w:pPr>
         <w:pStyle w:val="Heading2"/>
         <w:spacing w:after="120" w:before="360"/>
       </w:pPr>
@@ -13082,11 +13153,6 @@
     </w:tbl>
     <w:p>
       <w:pPr>
-        <w:spacing w:after="120" w:before="0"/>
-      </w:pPr>
-    </w:p>
-    <w:p>
-      <w:pPr>
         <w:pStyle w:val="Heading2"/>
         <w:spacing w:after="120" w:before="360"/>
       </w:pPr>
@@ -13468,11 +13534,6 @@
         </w:tc>
       </w:tr>
     </w:tbl>
-    <w:p>
-      <w:pPr>
-        <w:spacing w:after="240" w:before="0"/>
-      </w:pPr>
-    </w:p>
     <w:p>
       <w:pPr>
         <w:pStyle w:val="Heading1"/>
@@ -14492,19 +14553,6 @@
         </w:tc>
       </w:tr>
     </w:tbl>
-    <w:p>
-      <w:pPr>
-        <w:spacing w:after="240" w:before="0"/>
-      </w:pPr>
-    </w:p>
-    <w:p>
-      <w:pPr>
-        <w:pBdr>
-          <w:bottom w:val="single" w:color="6366F1" w:sz="6"/>
-        </w:pBdr>
-        <w:spacing w:after="200" w:before="200"/>
-      </w:pPr>
-    </w:p>
     <w:p>
       <w:pPr>
         <w:spacing w:after="0" w:before="200"/>

</xml_diff>